<commit_message>
v22.32 / v22.35: Data Safety review fixes — reminders kept on each computer, no forward for re-open/un-approve or future stamps, refused-store back-off, merge-owed stores wait, calls cache drop
- The daily approval reminder never writes the synced issue (local map hnxlocal_issue_reminders_v1), so it can no longer undo an approval
- Calls/issues: a newer local stamp forwards only if it does not move the record back and is not >10 min in the future; reminder bookkeeping is no change; RULE 4
- A store the cloud refused is re-sent only when it changes or after 30 min
- A big store whose merge waits keeps its old cloud copy in memory and is not uploaded until merged
- The calls read cache drops on every sync write
- Guide + Word guide updated; tests: reminder contract, approval survives, un-approve/clock-ahead held, reminder lines ignored, back-off, owed, cache

Co-Authored-By: Claude Opus 5.5 <noreply@anthropic.com>
Claude-Session: https://claude.ai/code/session_01T49gnSNZq31rPRt1vHk4Rc
</commit_message>
<xml_diff>
--- a/nexidoc/Nexi_User_Guide_v22.32.docx
+++ b/nexidoc/Nexi_User_Guide_v22.32.docx
@@ -16121,12 +16121,12 @@
     </w:p>
     <w:p>
       <w:r>
-        <w:t>Now those changes are dated, the daily reminder touches only an issue a person marked resolved, and for calls and issues the guard asks which copy is newer: a call or issue changed on this computer with a NEWER date — and not re-opened — is ordinary work and uploads by itself. Still held for your decision: records removed in bulk, a bulk re-open of closed calls or resolved issues, and an older or undated copy (a computer that missed other people's work).</w:t>
-      </w:r>
-    </w:p>
-    <w:p>
-      <w:r>
-        <w:t>If the cloud does not take a store (the cloud worker in use, 3.7.0, drops any store over 5 MB — calls on some computers), the sync line now says “not stored by the cloud (too big): calls — kept on this computer” and the store stays unsent here instead of looking uploaded. The fix is to update the hnx-sync worker to 3.7.2 (20 MB) in Cloudflare — an owner step.</w:t>
+        <w:t>Now those changes are dated, and the daily approval reminder is kept on each computer — it never changes the issue itself, so a reminder can no longer undo an approval given on another computer. For calls and issues the guard asks which copy is newer: a call or issue changed on this computer with a NEWER date that does not move it back (re-open, un-approve) is ordinary work and uploads by itself. A date more than 10 minutes in the future (a computer whose clock runs ahead) is not trusted. Still held for your decision: records removed in bulk, a bulk re-open or un-approve, a computer whose clock runs ahead, and an old copy that would undo newer work from another computer.</w:t>
+      </w:r>
+    </w:p>
+    <w:p>
+      <w:r>
+        <w:t>If the cloud does not take a store (the cloud worker in use, 3.7.0, drops any store over 5 MB — calls on some computers), the sync line now says “not stored by the cloud (too big): calls — kept on this computer” and the store stays unsent here instead of looking uploaded. Nexi tries that store again when it changes, or after 30 minutes — not on every sync, which only slowed the office line. A big store whose merge with the newest cloud copy is still waiting (big stores merge at most every 5 minutes) is uploaded only after that merge. The fix is to update the hnx-sync worker to 3.7.2 (20 MB) in Cloudflare — an owner step.</w:t>
       </w:r>
     </w:p>
     <w:p>

</xml_diff>